<commit_message>
Update trivia quiz in game.js and family tree details DOCX to align with simplified family tree (40 questions)
</commit_message>
<xml_diff>
--- a/פירוט אילן המשפחה.docx
+++ b/פירוט אילן המשפחה.docx
@@ -34,26 +34,71 @@
           <w:bCs/>
           <w:rtl/>
         </w:rPr>
-        <w:t xml:space="preserve"> משפחת אלטרס</w:t>
-      </w:r>
+        <w:t xml:space="preserve"> משפחת </w:t>
+      </w:r>
+      <w:proofErr w:type="spellStart"/>
+      <w:r>
+        <w:rPr>
+          <w:rFonts w:hint="cs"/>
+          <w:b/>
+          <w:bCs/>
+          <w:rtl/>
+        </w:rPr>
+        <w:t>אלטרס</w:t>
+      </w:r>
+      <w:proofErr w:type="spellEnd"/>
     </w:p>
     <w:p>
       <w:pPr>
         <w:bidi/>
       </w:pPr>
+      <w:proofErr w:type="spellStart"/>
       <w:r>
         <w:rPr>
           <w:b/>
           <w:bCs/>
           <w:rtl/>
         </w:rPr>
-        <w:t>סולטנה ורפאל אלטרס</w:t>
-      </w:r>
-      <w:r>
-        <w:rPr>
-          <w:rtl/>
-        </w:rPr>
-        <w:t xml:space="preserve"> לזוג נולדו 5 ילדים: פרלה, דונה, שרה, לואיזה ויעקב</w:t>
+        <w:t>סולטנה</w:t>
+      </w:r>
+      <w:proofErr w:type="spellEnd"/>
+      <w:r>
+        <w:rPr>
+          <w:b/>
+          <w:bCs/>
+          <w:rtl/>
+        </w:rPr>
+        <w:t xml:space="preserve"> ורפאל </w:t>
+      </w:r>
+      <w:proofErr w:type="spellStart"/>
+      <w:r>
+        <w:rPr>
+          <w:b/>
+          <w:bCs/>
+          <w:rtl/>
+        </w:rPr>
+        <w:t>אלטרס</w:t>
+      </w:r>
+      <w:proofErr w:type="spellEnd"/>
+      <w:r>
+        <w:rPr>
+          <w:rtl/>
+        </w:rPr>
+        <w:t xml:space="preserve"> לזוג נולדו 5 ילדים: </w:t>
+      </w:r>
+      <w:proofErr w:type="spellStart"/>
+      <w:r>
+        <w:rPr>
+          <w:rtl/>
+        </w:rPr>
+        <w:t>פרלה</w:t>
+      </w:r>
+      <w:proofErr w:type="spellEnd"/>
+      <w:r>
+        <w:rPr>
+          <w:rtl/>
+        </w:rPr>
+        <w:t>, דונה, שרה, לואיזה ויעקב</w:t>
       </w:r>
       <w:r>
         <w:t>.</w:t>
@@ -79,139 +124,38 @@
         <w:rPr>
           <w:rtl/>
         </w:rPr>
-        <w:t xml:space="preserve"> נשואה לניסים אדטו</w:t>
-      </w:r>
-      <w:r>
-        <w:rPr>
-          <w:rFonts w:hint="cs"/>
-          <w:rtl/>
-        </w:rPr>
-        <w:t xml:space="preserve">. לשניים שלושה ילדים, ג'ו, ויקי וראלף. </w:t>
-      </w:r>
-    </w:p>
-    <w:p>
-      <w:pPr>
-        <w:numPr>
-          <w:ilvl w:val="1"/>
-          <w:numId w:val="1"/>
-        </w:numPr>
-        <w:bidi/>
-      </w:pPr>
-      <w:r>
-        <w:rPr>
-          <w:b/>
-          <w:bCs/>
-          <w:rtl/>
-        </w:rPr>
-        <w:t>ג'ו</w:t>
-      </w:r>
-      <w:r>
-        <w:rPr>
-          <w:rtl/>
-        </w:rPr>
-        <w:t xml:space="preserve"> נשוי לג'ין</w:t>
-      </w:r>
-      <w:r>
-        <w:rPr>
-          <w:rFonts w:hint="cs"/>
-          <w:rtl/>
-        </w:rPr>
-        <w:t>. להם בת אחת, קרול</w:t>
-      </w:r>
-    </w:p>
-    <w:p>
-      <w:pPr>
-        <w:numPr>
-          <w:ilvl w:val="1"/>
-          <w:numId w:val="1"/>
-        </w:numPr>
-        <w:bidi/>
-      </w:pPr>
-      <w:r>
-        <w:rPr>
-          <w:b/>
-          <w:bCs/>
-          <w:rtl/>
-        </w:rPr>
-        <w:t>ויקי</w:t>
-      </w:r>
-      <w:r>
-        <w:rPr>
-          <w:rtl/>
-        </w:rPr>
-        <w:t xml:space="preserve"> נשואה לג'ק</w:t>
-      </w:r>
+        <w:t xml:space="preserve"> נשואה לניסים </w:t>
+      </w:r>
+      <w:proofErr w:type="spellStart"/>
+      <w:r>
+        <w:rPr>
+          <w:rtl/>
+        </w:rPr>
+        <w:t>אדטו</w:t>
+      </w:r>
+      <w:proofErr w:type="spellEnd"/>
+      <w:r>
+        <w:rPr>
+          <w:rFonts w:hint="cs"/>
+          <w:rtl/>
+        </w:rPr>
+        <w:t xml:space="preserve">. לשניים שלושה ילדים, ג'ו, ויקי </w:t>
+      </w:r>
+      <w:proofErr w:type="spellStart"/>
+      <w:r>
+        <w:rPr>
+          <w:rFonts w:hint="cs"/>
+          <w:rtl/>
+        </w:rPr>
+        <w:t>וראלף</w:t>
+      </w:r>
+      <w:proofErr w:type="spellEnd"/>
       <w:r>
         <w:rPr>
           <w:rFonts w:hint="cs"/>
           <w:rtl/>
         </w:rPr>
         <w:t xml:space="preserve">. </w:t>
-      </w:r>
-      <w:r>
-        <w:rPr>
-          <w:rFonts w:hint="cs"/>
-          <w:rtl/>
-        </w:rPr>
-        <w:t xml:space="preserve">להם </w:t>
-      </w:r>
-      <w:r>
-        <w:rPr>
-          <w:rFonts w:hint="cs"/>
-          <w:rtl/>
-        </w:rPr>
-        <w:t>3</w:t>
-      </w:r>
-      <w:r>
-        <w:rPr>
-          <w:rFonts w:hint="cs"/>
-          <w:rtl/>
-        </w:rPr>
-        <w:t xml:space="preserve"> ילדים: סטיב ורוני</w:t>
-      </w:r>
-      <w:r>
-        <w:rPr>
-          <w:rFonts w:hint="cs"/>
-          <w:rtl/>
-        </w:rPr>
-        <w:t xml:space="preserve"> וילד נוסף</w:t>
-      </w:r>
-    </w:p>
-    <w:p>
-      <w:pPr>
-        <w:numPr>
-          <w:ilvl w:val="1"/>
-          <w:numId w:val="1"/>
-        </w:numPr>
-        <w:bidi/>
-      </w:pPr>
-      <w:r>
-        <w:rPr>
-          <w:b/>
-          <w:bCs/>
-          <w:rtl/>
-        </w:rPr>
-        <w:t>ראלף</w:t>
-      </w:r>
-      <w:r>
-        <w:rPr>
-          <w:rtl/>
-        </w:rPr>
-        <w:t xml:space="preserve"> נשוי למרסל</w:t>
-      </w:r>
-      <w:r>
-        <w:rPr>
-          <w:rFonts w:hint="cs"/>
-          <w:rtl/>
-        </w:rPr>
-        <w:t>. להם בת קארן</w:t>
-      </w:r>
-      <w:r>
-        <w:rPr>
-          <w:rFonts w:hint="cs"/>
-          <w:rtl/>
-        </w:rPr>
-        <w:t xml:space="preserve"> וילד נוסף</w:t>
       </w:r>
     </w:p>
     <w:p>
@@ -223,6 +167,7 @@
         </w:numPr>
         <w:bidi/>
       </w:pPr>
+      <w:proofErr w:type="spellStart"/>
       <w:r>
         <w:rPr>
           <w:b/>
@@ -231,6 +176,7 @@
         </w:rPr>
         <w:t>פרלה</w:t>
       </w:r>
+      <w:proofErr w:type="spellEnd"/>
       <w:r>
         <w:rPr>
           <w:rtl/>
@@ -250,133 +196,6 @@
           <w:rtl/>
         </w:rPr>
         <w:t xml:space="preserve">, יהודית. </w:t>
-      </w:r>
-    </w:p>
-    <w:p>
-      <w:pPr>
-        <w:numPr>
-          <w:ilvl w:val="1"/>
-          <w:numId w:val="1"/>
-        </w:numPr>
-        <w:bidi/>
-      </w:pPr>
-      <w:r>
-        <w:rPr>
-          <w:b/>
-          <w:bCs/>
-          <w:rtl/>
-        </w:rPr>
-        <w:t>יהודית</w:t>
-      </w:r>
-      <w:r>
-        <w:rPr>
-          <w:rtl/>
-        </w:rPr>
-        <w:t xml:space="preserve"> נשואה לשמואל</w:t>
-      </w:r>
-      <w:r>
-        <w:rPr>
-          <w:rFonts w:hint="cs"/>
-          <w:rtl/>
-        </w:rPr>
-        <w:t>. לשניים שלושה ילדים, צחי, פנינה ועדי</w:t>
-      </w:r>
-    </w:p>
-    <w:p>
-      <w:pPr>
-        <w:numPr>
-          <w:ilvl w:val="2"/>
-          <w:numId w:val="1"/>
-        </w:numPr>
-        <w:bidi/>
-      </w:pPr>
-      <w:r>
-        <w:rPr>
-          <w:b/>
-          <w:bCs/>
-          <w:rtl/>
-        </w:rPr>
-        <w:t>צחי</w:t>
-      </w:r>
-      <w:r>
-        <w:rPr>
-          <w:rtl/>
-        </w:rPr>
-        <w:t xml:space="preserve"> נשוי לעירית</w:t>
-      </w:r>
-      <w:r>
-        <w:rPr>
-          <w:rFonts w:hint="cs"/>
-          <w:rtl/>
-        </w:rPr>
-        <w:t xml:space="preserve">. </w:t>
-      </w:r>
-      <w:r>
-        <w:rPr>
-          <w:rFonts w:hint="cs"/>
-          <w:rtl/>
-        </w:rPr>
-        <w:t>להם 3 ילדים: אור, לירון וטל</w:t>
-      </w:r>
-    </w:p>
-    <w:p>
-      <w:pPr>
-        <w:numPr>
-          <w:ilvl w:val="2"/>
-          <w:numId w:val="1"/>
-        </w:numPr>
-        <w:bidi/>
-      </w:pPr>
-      <w:r>
-        <w:rPr>
-          <w:b/>
-          <w:bCs/>
-          <w:rtl/>
-        </w:rPr>
-        <w:t>פנינה</w:t>
-      </w:r>
-      <w:r>
-        <w:rPr>
-          <w:rtl/>
-        </w:rPr>
-        <w:t xml:space="preserve"> נשואה לאבי</w:t>
-      </w:r>
-      <w:r>
-        <w:rPr>
-          <w:rFonts w:hint="cs"/>
-          <w:rtl/>
-        </w:rPr>
-        <w:t>. להם 3 ילדים: תום, לידור ואלמוג</w:t>
-      </w:r>
-    </w:p>
-    <w:p>
-      <w:pPr>
-        <w:numPr>
-          <w:ilvl w:val="2"/>
-          <w:numId w:val="1"/>
-        </w:numPr>
-        <w:bidi/>
-      </w:pPr>
-      <w:r>
-        <w:rPr>
-          <w:b/>
-          <w:bCs/>
-          <w:rtl/>
-        </w:rPr>
-        <w:t>עדי</w:t>
-      </w:r>
-      <w:r>
-        <w:rPr>
-          <w:rtl/>
-        </w:rPr>
-        <w:t xml:space="preserve"> נשוי למיטל</w:t>
-      </w:r>
-      <w:r>
-        <w:rPr>
-          <w:rFonts w:hint="cs"/>
-          <w:rtl/>
-        </w:rPr>
-        <w:t>. להם שני ילדים: אופק ומאור</w:t>
       </w:r>
     </w:p>
     <w:p>
@@ -419,7 +238,7 @@
     <w:p>
       <w:pPr>
         <w:numPr>
-          <w:ilvl w:val="1"/>
+          <w:ilvl w:val="0"/>
           <w:numId w:val="2"/>
         </w:numPr>
         <w:bidi/>
@@ -430,131 +249,67 @@
           <w:bCs/>
           <w:rtl/>
         </w:rPr>
-        <w:t>אתי</w:t>
-      </w:r>
-      <w:r>
-        <w:rPr>
-          <w:rtl/>
-        </w:rPr>
-        <w:t xml:space="preserve"> נשואה למשה</w:t>
-      </w:r>
-      <w:r>
-        <w:rPr>
-          <w:rFonts w:hint="cs"/>
-          <w:rtl/>
-        </w:rPr>
-        <w:t>. לשניים שלושה ילדים, שרה, דליה ואיזבל</w:t>
-      </w:r>
-    </w:p>
-    <w:p>
-      <w:pPr>
-        <w:numPr>
-          <w:ilvl w:val="2"/>
-          <w:numId w:val="2"/>
-        </w:numPr>
-        <w:bidi/>
-      </w:pPr>
-      <w:r>
-        <w:rPr>
-          <w:b/>
-          <w:bCs/>
-          <w:rtl/>
-        </w:rPr>
         <w:t>שרה</w:t>
       </w:r>
       <w:r>
         <w:rPr>
           <w:rtl/>
         </w:rPr>
-        <w:t xml:space="preserve"> נשואה לאור</w:t>
-      </w:r>
-      <w:r>
-        <w:rPr>
-          <w:rFonts w:hint="cs"/>
-          <w:rtl/>
-        </w:rPr>
-        <w:t>חן</w:t>
-      </w:r>
-      <w:r>
-        <w:rPr>
-          <w:rFonts w:hint="cs"/>
-          <w:rtl/>
-        </w:rPr>
-        <w:t>. להם 2 ילדים: מליך ומרט</w:t>
-      </w:r>
-    </w:p>
-    <w:p>
-      <w:pPr>
-        <w:numPr>
-          <w:ilvl w:val="2"/>
-          <w:numId w:val="2"/>
-        </w:numPr>
-        <w:bidi/>
-      </w:pPr>
-      <w:r>
-        <w:rPr>
-          <w:b/>
-          <w:bCs/>
-          <w:rtl/>
-        </w:rPr>
-        <w:t>דליה</w:t>
-      </w:r>
-      <w:r>
-        <w:rPr>
-          <w:rtl/>
-        </w:rPr>
-        <w:t xml:space="preserve"> נשואה למאיר</w:t>
-      </w:r>
-      <w:r>
-        <w:rPr>
-          <w:rFonts w:hint="cs"/>
-          <w:rtl/>
-        </w:rPr>
-        <w:t>. להם 2 ילדים: סנדי וטרייסי</w:t>
-      </w:r>
-    </w:p>
-    <w:p>
-      <w:pPr>
-        <w:numPr>
-          <w:ilvl w:val="2"/>
-          <w:numId w:val="2"/>
-        </w:numPr>
-        <w:bidi/>
-      </w:pPr>
-      <w:r>
-        <w:rPr>
-          <w:b/>
-          <w:bCs/>
-          <w:rtl/>
-        </w:rPr>
-        <w:t>איזבל</w:t>
-      </w:r>
-      <w:r>
-        <w:rPr>
-          <w:rtl/>
-        </w:rPr>
-        <w:t xml:space="preserve"> נשואה </w:t>
-      </w:r>
-      <w:r>
-        <w:rPr>
-          <w:rFonts w:hint="cs"/>
-          <w:rtl/>
-        </w:rPr>
-        <w:t>לחייטי</w:t>
-      </w:r>
-      <w:r>
-        <w:rPr>
-          <w:rFonts w:hint="cs"/>
-          <w:rtl/>
-        </w:rPr>
-        <w:t xml:space="preserve">: </w:t>
-      </w:r>
-      <w:r>
-        <w:rPr>
-          <w:rFonts w:hint="cs"/>
-          <w:rtl/>
-        </w:rPr>
-        <w:t>להם בן אחד, רמי</w:t>
+        <w:t xml:space="preserve"> </w:t>
+      </w:r>
+      <w:r>
+        <w:rPr>
+          <w:rFonts w:hint="cs"/>
+          <w:rtl/>
+        </w:rPr>
+        <w:t xml:space="preserve">- </w:t>
+      </w:r>
+      <w:r>
+        <w:rPr>
+          <w:rtl/>
+        </w:rPr>
+        <w:t xml:space="preserve">נישאה שלוש פעמים: 1. רפאל שאול, 2. מאיר </w:t>
+      </w:r>
+      <w:proofErr w:type="spellStart"/>
+      <w:r>
+        <w:rPr>
+          <w:rtl/>
+        </w:rPr>
+        <w:t>דסה</w:t>
+      </w:r>
+      <w:proofErr w:type="spellEnd"/>
+      <w:r>
+        <w:rPr>
+          <w:rtl/>
+        </w:rPr>
+        <w:t xml:space="preserve">, 3. ניסים </w:t>
+      </w:r>
+      <w:proofErr w:type="spellStart"/>
+      <w:r>
+        <w:rPr>
+          <w:rtl/>
+        </w:rPr>
+        <w:t>אדטו</w:t>
+      </w:r>
+      <w:proofErr w:type="spellEnd"/>
+      <w:r>
+        <w:rPr>
+          <w:rtl/>
+        </w:rPr>
+        <w:t xml:space="preserve"> - האלמן של אחותה לואיזה</w:t>
+      </w:r>
+      <w:r>
+        <w:rPr>
+          <w:rFonts w:hint="cs"/>
+          <w:rtl/>
+        </w:rPr>
+        <w:t xml:space="preserve">. לשרה בת אחת, מלכה, </w:t>
+      </w:r>
+      <w:r>
+        <w:rPr>
+          <w:rtl/>
+        </w:rPr>
+        <w:t xml:space="preserve">מנישואיה לרפאל שאול. </w:t>
       </w:r>
     </w:p>
     <w:p>
@@ -567,158 +322,6 @@
       </w:pPr>
       <w:r>
         <w:rPr>
-          <w:b/>
-          <w:bCs/>
-          <w:rtl/>
-        </w:rPr>
-        <w:t>ג'קי</w:t>
-      </w:r>
-      <w:r>
-        <w:rPr>
-          <w:rtl/>
-        </w:rPr>
-        <w:t xml:space="preserve"> נשוי ללואיזה</w:t>
-      </w:r>
-      <w:r>
-        <w:rPr>
-          <w:rFonts w:hint="cs"/>
-          <w:rtl/>
-        </w:rPr>
-        <w:t>. לשניים שני ילדים. דולי ואלפר</w:t>
-      </w:r>
-      <w:r>
-        <w:rPr>
-          <w:rtl/>
-        </w:rPr>
-        <w:t xml:space="preserve"> </w:t>
-      </w:r>
-    </w:p>
-    <w:p>
-      <w:pPr>
-        <w:numPr>
-          <w:ilvl w:val="2"/>
-          <w:numId w:val="2"/>
-        </w:numPr>
-        <w:bidi/>
-      </w:pPr>
-      <w:r>
-        <w:rPr>
-          <w:b/>
-          <w:bCs/>
-          <w:rtl/>
-        </w:rPr>
-        <w:t>דולי</w:t>
-      </w:r>
-      <w:r>
-        <w:rPr>
-          <w:rtl/>
-        </w:rPr>
-        <w:t xml:space="preserve"> נשואה לאיזט</w:t>
-      </w:r>
-      <w:r>
-        <w:rPr>
-          <w:rFonts w:hint="cs"/>
-          <w:rtl/>
-        </w:rPr>
-        <w:t>. להם 2 בנות: דינה ולאה</w:t>
-      </w:r>
-    </w:p>
-    <w:p>
-      <w:pPr>
-        <w:numPr>
-          <w:ilvl w:val="2"/>
-          <w:numId w:val="2"/>
-        </w:numPr>
-        <w:bidi/>
-      </w:pPr>
-      <w:r>
-        <w:rPr>
-          <w:b/>
-          <w:bCs/>
-          <w:rtl/>
-        </w:rPr>
-        <w:t>אלפר</w:t>
-      </w:r>
-      <w:r>
-        <w:rPr>
-          <w:rtl/>
-        </w:rPr>
-        <w:t xml:space="preserve"> נשוי לסובל</w:t>
-      </w:r>
-      <w:r>
-        <w:rPr>
-          <w:rFonts w:hint="cs"/>
-          <w:rtl/>
-        </w:rPr>
-        <w:t xml:space="preserve">. להם 2 </w:t>
-      </w:r>
-      <w:r>
-        <w:rPr>
-          <w:rFonts w:hint="cs"/>
-          <w:rtl/>
-        </w:rPr>
-        <w:t>בנים: ג'רי וברי</w:t>
-      </w:r>
-    </w:p>
-    <w:p>
-      <w:pPr>
-        <w:numPr>
-          <w:ilvl w:val="0"/>
-          <w:numId w:val="2"/>
-        </w:numPr>
-        <w:bidi/>
-      </w:pPr>
-      <w:r>
-        <w:rPr>
-          <w:b/>
-          <w:bCs/>
-          <w:rtl/>
-        </w:rPr>
-        <w:t>שרה</w:t>
-      </w:r>
-      <w:r>
-        <w:rPr>
-          <w:rtl/>
-        </w:rPr>
-        <w:t xml:space="preserve"> </w:t>
-      </w:r>
-      <w:r>
-        <w:rPr>
-          <w:rFonts w:hint="cs"/>
-          <w:rtl/>
-        </w:rPr>
-        <w:t xml:space="preserve">- </w:t>
-      </w:r>
-      <w:r>
-        <w:rPr>
-          <w:rtl/>
-        </w:rPr>
-        <w:t>נישאה שלוש פעמים: 1. רפאל שאול, 2. מאיר דסה, 3. ניסים אדטו - האלמן של אחותה לואיזה</w:t>
-      </w:r>
-      <w:r>
-        <w:rPr>
-          <w:rFonts w:hint="cs"/>
-          <w:rtl/>
-        </w:rPr>
-        <w:t xml:space="preserve">. לשרה בת אחת, מלכה, </w:t>
-      </w:r>
-      <w:r>
-        <w:rPr>
-          <w:rtl/>
-        </w:rPr>
-        <w:t xml:space="preserve">מנישואיה לרפאל שאול. </w:t>
-      </w:r>
-    </w:p>
-    <w:p>
-      <w:pPr>
-        <w:numPr>
-          <w:ilvl w:val="1"/>
-          <w:numId w:val="2"/>
-        </w:numPr>
-        <w:bidi/>
-      </w:pPr>
-      <w:r>
-        <w:rPr>
           <w:rFonts w:hint="cs"/>
           <w:b/>
           <w:bCs/>
@@ -930,8 +533,16 @@
         <w:rPr>
           <w:rtl/>
         </w:rPr>
-        <w:t xml:space="preserve"> נשואה לערן ברס</w:t>
-      </w:r>
+        <w:t xml:space="preserve"> נשואה לערן </w:t>
+      </w:r>
+      <w:proofErr w:type="spellStart"/>
+      <w:r>
+        <w:rPr>
+          <w:rtl/>
+        </w:rPr>
+        <w:t>ברס</w:t>
+      </w:r>
+      <w:proofErr w:type="spellEnd"/>
       <w:r>
         <w:rPr>
           <w:rFonts w:hint="cs"/>
@@ -1004,8 +615,8 @@
     <w:p>
       <w:pPr>
         <w:numPr>
-          <w:ilvl w:val="1"/>
-          <w:numId w:val="5"/>
+          <w:ilvl w:val="0"/>
+          <w:numId w:val="2"/>
         </w:numPr>
         <w:bidi/>
       </w:pPr>

</xml_diff>